<commit_message>
feat(cad): video Modul 1 versi klik GUI langkah demi langkah + teks langkah 3 sesuai FreeCAD 1.1
- Video Praktik Terbimbing Modul 1 diganti (1:43 -> 3:01): kursor bergerak ke menu,
  toolbar, panel Tasks, dan dialog; nilai diketik di kolomnya. Tujuh bab, satu per langkah.
- Langkah 3: sudut kedua Rectangle diketik sebagai ΔX 120, ΔY 60, ΔZ 0 (panel FreeCAD 1.1
  tidak menampilkan Length/Height); contoh Bagian 08 disesuaikan (ΔX 100, ΔY 50).
- Langkah 5: catatan peringatan "Non-solids selected" -> pilih Yes.

Co-Authored-By: Claude Opus 5.5 <noreply@anthropic.com>
</commit_message>
<xml_diff>
--- a/Pemodelan-Computer-Aided-Design/Modul-Word/Modul-1-Pengenalan-FreeCAD-dan-Menggambar-2D.docx
+++ b/Pemodelan-Computer-Aided-Design/Modul-Word/Modul-1-Pengenalan-FreeCAD-dan-Menggambar-2D.docx
@@ -12079,7 +12079,7 @@
           <w:i w:val="0"/>
           <w:sz w:val="22"/>
         </w:rPr>
-        <w:t xml:space="preserve">Draft → Rectangle. Ketik 0 ⏎ 0 ⏎ 0 ⏎ untuk sudut pertama, lalu masukkan Length 120 dan Height 60 pada panel Tasks. Di tab Data, pastikan </w:t>
+        <w:t xml:space="preserve">Draft → Rectangle. Ketik 0 ⏎ 0 ⏎ 0 ⏎ untuk sudut pertama, lalu untuk sudut kedua (relatif terhadap sudut pertama) ketik ΔX 120 ⏎ ΔY 60 ⏎ ΔZ 0 ⏎ pada panel Tasks. Di tab Data, pastikan </w:t>
       </w:r>
       <w:r>
         <w:rPr>
@@ -12181,7 +12181,25 @@
           <w:i w:val="0"/>
           <w:sz w:val="22"/>
         </w:rPr>
-        <w:t>. Pilih Rectangle, Ctrl+klik Circle → Part → Boolean → Cut. Pilih Cut, Ctrl+klik Circle001 → Cut lagi. Hasil: Cut001.</w:t>
+        <w:t xml:space="preserve">. Pilih Rectangle, Ctrl+klik Circle → Part → Boolean → Cut. Bila muncul peringatan </w:t>
+      </w:r>
+      <w:r>
+        <w:rPr>
+          <w:rFonts w:ascii="Arial" w:hAnsi="Arial" w:eastAsia="Arial" w:cs="Arial"/>
+          <w:b w:val="0"/>
+          <w:i/>
+          <w:sz w:val="22"/>
+        </w:rPr>
+        <w:t>Non-solids selected</w:t>
+      </w:r>
+      <w:r>
+        <w:rPr>
+          <w:rFonts w:ascii="Arial" w:hAnsi="Arial" w:eastAsia="Arial" w:cs="Arial"/>
+          <w:b w:val="0"/>
+          <w:i w:val="0"/>
+          <w:sz w:val="22"/>
+        </w:rPr>
+        <w:t>, pilih Yes. Pilih Cut, Ctrl+klik Circle001 → Cut lagi. Hasil: Cut001.</w:t>
       </w:r>
     </w:p>
     <w:p>

</xml_diff>

<commit_message>
feat(cad): video Modul 1 versi klik GUI langkah demi langkah + teks langkah 3 sesuai FreeCAD 1.1 (#1036)
- Video Praktik Terbimbing Modul 1 diganti (1:43 -> 3:01): kursor bergerak ke menu,
  toolbar, panel Tasks, dan dialog; nilai diketik di kolomnya. Tujuh bab, satu per langkah.
- Langkah 3: sudut kedua Rectangle diketik sebagai ΔX 120, ΔY 60, ΔZ 0 (panel FreeCAD 1.1
  tidak menampilkan Length/Height); contoh Bagian 08 disesuaikan (ΔX 100, ΔY 50).
- Langkah 5: catatan peringatan "Non-solids selected" -> pilih Yes.

Co-authored-by: Claude Opus 5.5 <noreply@anthropic.com>
</commit_message>
<xml_diff>
--- a/Pemodelan-Computer-Aided-Design/Modul-Word/Modul-1-Pengenalan-FreeCAD-dan-Menggambar-2D.docx
+++ b/Pemodelan-Computer-Aided-Design/Modul-Word/Modul-1-Pengenalan-FreeCAD-dan-Menggambar-2D.docx
@@ -12079,7 +12079,7 @@
           <w:i w:val="0"/>
           <w:sz w:val="22"/>
         </w:rPr>
-        <w:t xml:space="preserve">Draft → Rectangle. Ketik 0 ⏎ 0 ⏎ 0 ⏎ untuk sudut pertama, lalu masukkan Length 120 dan Height 60 pada panel Tasks. Di tab Data, pastikan </w:t>
+        <w:t xml:space="preserve">Draft → Rectangle. Ketik 0 ⏎ 0 ⏎ 0 ⏎ untuk sudut pertama, lalu untuk sudut kedua (relatif terhadap sudut pertama) ketik ΔX 120 ⏎ ΔY 60 ⏎ ΔZ 0 ⏎ pada panel Tasks. Di tab Data, pastikan </w:t>
       </w:r>
       <w:r>
         <w:rPr>
@@ -12181,7 +12181,25 @@
           <w:i w:val="0"/>
           <w:sz w:val="22"/>
         </w:rPr>
-        <w:t>. Pilih Rectangle, Ctrl+klik Circle → Part → Boolean → Cut. Pilih Cut, Ctrl+klik Circle001 → Cut lagi. Hasil: Cut001.</w:t>
+        <w:t xml:space="preserve">. Pilih Rectangle, Ctrl+klik Circle → Part → Boolean → Cut. Bila muncul peringatan </w:t>
+      </w:r>
+      <w:r>
+        <w:rPr>
+          <w:rFonts w:ascii="Arial" w:hAnsi="Arial" w:eastAsia="Arial" w:cs="Arial"/>
+          <w:b w:val="0"/>
+          <w:i/>
+          <w:sz w:val="22"/>
+        </w:rPr>
+        <w:t>Non-solids selected</w:t>
+      </w:r>
+      <w:r>
+        <w:rPr>
+          <w:rFonts w:ascii="Arial" w:hAnsi="Arial" w:eastAsia="Arial" w:cs="Arial"/>
+          <w:b w:val="0"/>
+          <w:i w:val="0"/>
+          <w:sz w:val="22"/>
+        </w:rPr>
+        <w:t>, pilih Yes. Pilih Cut, Ctrl+klik Circle001 → Cut lagi. Hasil: Cut001.</w:t>
       </w:r>
     </w:p>
     <w:p>

</xml_diff>